<commit_message>
deleted:    notebooks/.~lock.NBA_Executive_Summary.docx# 	modified:   notebooks/NBA_Executive_Summary.docx 	modified:   notebooks/baselines_rf_et_xgb.ipynb 	new file:   notebooks/model_comparison_p_value.png 	deleted:    notebooks/plot_accuracy.png
</commit_message>
<xml_diff>
--- a/notebooks/NBA_Executive_Summary.docx
+++ b/notebooks/NBA_Executive_Summary.docx
@@ -36,16 +36,7 @@
           <w:sz w:val="18"/>
           <w:szCs w:val="18"/>
         </w:rPr>
-        <w:t xml:space="preserve">Executive Summary — Erdős Institute Data Science </w:t>
-      </w:r>
-      <w:r>
-        <w:rPr>
-          <w:i w:val="false"/>
-          <w:iCs w:val="false"/>
-          <w:sz w:val="18"/>
-          <w:szCs w:val="18"/>
-        </w:rPr>
-        <w:t>Boot Camp, Summer 2026</w:t>
+        <w:t>Executive Summary — Erdős Institute Data Science Boot Camp, Summer 2026</w:t>
       </w:r>
     </w:p>
     <w:p>
@@ -142,14 +133,17 @@
       <w:pPr>
         <w:pStyle w:val="Normal"/>
         <w:spacing w:before="0" w:after="80"/>
-        <w:rPr/>
-      </w:pPr>
-      <w:r>
-        <w:rPr>
-          <w:sz w:val="18"/>
-          <w:szCs w:val="18"/>
-        </w:rPr>
-        <w:t>Develop a machine learning system that predicts NBA head-to-head win probability using historical team-level win/loss records and rolling individual/team performance metrics. Target use cases: game-by-game win probability, and identifying the team characteristics most associated with winning.</w:t>
+        <w:rPr>
+          <w:sz w:val="18"/>
+          <w:szCs w:val="18"/>
+        </w:rPr>
+      </w:pPr>
+      <w:r>
+        <w:rPr>
+          <w:sz w:val="18"/>
+          <w:szCs w:val="18"/>
+        </w:rPr>
+        <w:t>Develop a machine learning system that predicts NBA head-to-head win probability using historical team-level win/loss records and rolling individual/team performance metrics.</w:t>
       </w:r>
     </w:p>
     <w:p>
@@ -182,28 +176,7 @@
           <w:sz w:val="18"/>
           <w:szCs w:val="18"/>
         </w:rPr>
-        <w:t>P</w:t>
-      </w:r>
-      <w:r>
-        <w:rPr>
-          <w:sz w:val="18"/>
-          <w:szCs w:val="18"/>
-        </w:rPr>
-        <w:t xml:space="preserve">rediction markets, </w:t>
-      </w:r>
-      <w:r>
-        <w:rPr>
-          <w:sz w:val="18"/>
-          <w:szCs w:val="18"/>
-        </w:rPr>
-        <w:t>sport bettors</w:t>
-      </w:r>
-      <w:r>
-        <w:rPr>
-          <w:sz w:val="18"/>
-          <w:szCs w:val="18"/>
-        </w:rPr>
-        <w:t xml:space="preserve"> and gamblers — all users who benefit from a data-driven probability of a team winning a given matchup.</w:t>
+        <w:t>Prediction markets, sport bettors and gamblers — all users who benefit from a data-driven probability of a team winning a given matchup.</w:t>
       </w:r>
     </w:p>
     <w:p>
@@ -236,7 +209,70 @@
           <w:sz w:val="18"/>
           <w:szCs w:val="18"/>
         </w:rPr>
-        <w:t>Sourced play-by-play and box-score data via the nba_api package and supporting Kaggle datasets (historical box scores, player stats). Cleaned to remove non-competitive exhibitions (All-Star Weekend) while retaining legitimate international regular-season games. Verified team-ID stability across franchise renames. Computed scheduling context features (rest days, back-to-backs) and split data into Regular-Season-only and Regular+Playoff scopes for separate evaluation.</w:t>
+        <w:t>Import the</w:t>
+      </w:r>
+      <w:r>
+        <w:rPr>
+          <w:sz w:val="18"/>
+          <w:szCs w:val="18"/>
+        </w:rPr>
+        <w:t xml:space="preserve"> play-by-play and box-score data via the nba_api package and </w:t>
+      </w:r>
+      <w:r>
+        <w:rPr>
+          <w:sz w:val="18"/>
+          <w:szCs w:val="18"/>
+        </w:rPr>
+        <w:t>open</w:t>
+      </w:r>
+      <w:r>
+        <w:rPr>
+          <w:sz w:val="18"/>
+          <w:szCs w:val="18"/>
+        </w:rPr>
+        <w:t xml:space="preserve"> Kaggle datasets (historical box scores, player stats). Cleaned to remove non-competitive </w:t>
+      </w:r>
+      <w:r>
+        <w:rPr>
+          <w:sz w:val="18"/>
+          <w:szCs w:val="18"/>
+        </w:rPr>
+        <w:t>games</w:t>
+      </w:r>
+      <w:r>
+        <w:rPr>
+          <w:sz w:val="18"/>
+          <w:szCs w:val="18"/>
+        </w:rPr>
+        <w:t xml:space="preserve"> (All-Star Weekend </w:t>
+      </w:r>
+      <w:r>
+        <w:rPr>
+          <w:sz w:val="18"/>
+          <w:szCs w:val="18"/>
+        </w:rPr>
+        <w:t>games</w:t>
+      </w:r>
+      <w:r>
+        <w:rPr>
+          <w:sz w:val="18"/>
+          <w:szCs w:val="18"/>
+        </w:rPr>
+        <w:t xml:space="preserve">) while retaining legitimate international regular-season games. Verified team-ID stability across franchise renames. </w:t>
+      </w:r>
+      <w:r>
+        <w:rPr>
+          <w:sz w:val="18"/>
+          <w:szCs w:val="18"/>
+        </w:rPr>
+        <w:t>S</w:t>
+      </w:r>
+      <w:r>
+        <w:rPr>
+          <w:sz w:val="18"/>
+          <w:szCs w:val="18"/>
+        </w:rPr>
+        <w:t>plit data into Regular-Season-only and Regular+Playoff scopes for separate evaluation.</w:t>
       </w:r>
     </w:p>
     <w:p>
@@ -269,7 +305,21 @@
           <w:sz w:val="18"/>
           <w:szCs w:val="18"/>
         </w:rPr>
-        <w:t>Engineered home-minus-away differential features from rolling 10-game averages and exponentially-weighted (halflife=3) team statistics: scoring, shooting efficiency, rebounding, assists, turnovers, steals, blocks, plus-minus, and recent win-rate. Sanity-check visualizations confirmed these differentials meaningfully separate wins from losses. Across every model family tested, plusMinusPoints consistently emerged as the single strongest predictor, with recent win-rate and shooting efficiency close behind; scheduling features (rest days, back-to-backs) carried comparatively little predictive weight.</w:t>
+        <w:t xml:space="preserve">Computed scheduling context features (rest days, back-to-backs). Engineered home-minus-away differential features from rolling 10-game averages and exponentially-weighted (halflife=3) team statistics: scoring, shooting efficiency, rebounding, assists, turnovers, steals, blocks, plus-minus, and recent win-rate. </w:t>
+      </w:r>
+      <w:r>
+        <w:rPr>
+          <w:sz w:val="18"/>
+          <w:szCs w:val="18"/>
+        </w:rPr>
+        <w:t>V</w:t>
+      </w:r>
+      <w:r>
+        <w:rPr>
+          <w:sz w:val="18"/>
+          <w:szCs w:val="18"/>
+        </w:rPr>
+        <w:t>isualizations confirmed these differentials meaningfully separate wins from losses. Across every model family tested, plusMinusPoints consistently emerged as the single strongest predictor, with recent win-rate and shooting efficiency close behind; scheduling features (rest days, back-to-backs) carried comparatively little predictive weight.</w:t>
       </w:r>
     </w:p>
     <w:p>
@@ -310,7 +360,7 @@
         <w:pStyle w:val="ListParagraph"/>
         <w:numPr>
           <w:ilvl w:val="0"/>
-          <w:numId w:val="3"/>
+          <w:numId w:val="4"/>
         </w:numPr>
         <w:spacing w:before="0" w:after="40"/>
         <w:rPr/>
@@ -328,7 +378,7 @@
         <w:pStyle w:val="ListParagraph"/>
         <w:numPr>
           <w:ilvl w:val="0"/>
-          <w:numId w:val="1"/>
+          <w:numId w:val="2"/>
         </w:numPr>
         <w:spacing w:before="0" w:after="40"/>
         <w:rPr/>
@@ -346,7 +396,7 @@
         <w:pStyle w:val="ListParagraph"/>
         <w:numPr>
           <w:ilvl w:val="0"/>
-          <w:numId w:val="1"/>
+          <w:numId w:val="2"/>
         </w:numPr>
         <w:spacing w:before="0" w:after="40"/>
         <w:rPr/>
@@ -364,7 +414,7 @@
         <w:pStyle w:val="ListParagraph"/>
         <w:numPr>
           <w:ilvl w:val="0"/>
-          <w:numId w:val="1"/>
+          <w:numId w:val="2"/>
         </w:numPr>
         <w:spacing w:before="0" w:after="40"/>
         <w:rPr/>
@@ -407,7 +457,7 @@
           <w:sz w:val="18"/>
           <w:szCs w:val="18"/>
         </w:rPr>
-        <w:t>Logistic Regression, the project's baseline, reached 64.8% accuracy (ROC-AUC 0.699) on the combined regular-season-plus-playoff dataset using the full engineered feature set. The Generalized Additive Model performed comparably at 62.9% accuracy (ROC-AUC 0.667) on its held-out test split, confirming that the relationships in the data are close to linear rather than sharply non-linear. Tree-based ensembles matched this range: Random Forest reached 64.9% accuracy in its best validation season, and Extra Trees peaked at 65.7% accuracy in 2024. XGBoost achieved 63.3% accuracy (ROC-AUC 0.674, log loss 0.645) on its chronological holdout.</w:t>
+        <w:t>Logistic Regression reached 64.8% accuracy (ROC-AUC 0.699) on the combined regular-season-plus-playoff dataset using the full engineered feature set. The Generalized Additive Model performed comparably at 62.9% accuracy (ROC-AUC 0.667) on its held-out test split, confirming that the relationships in the data are close to linear rather than sharply non-linear. Tree-based ensembles matched this range: Random Forest reached 64.9% accuracy in its best validation season, and Extra Trees peaked at 65.7% accuracy in 2024. XGBoost achieved 63.3% accuracy (ROC-AUC 0.674, log loss 0.645) on its chronological holdout.</w:t>
       </w:r>
     </w:p>
     <w:p>
@@ -421,7 +471,7 @@
           <w:sz w:val="18"/>
           <w:szCs w:val="18"/>
         </w:rPr>
-        <w:t>Taken together, all four model families converge to a similar ceiling of roughly 63–66% regular-season accuracy (ROC-AUC ≈ 0.65–0.71), pointing to an irreducible “any given night” noise floor in NBA outcomes rather than a modeling shortfall. Playoff-only prediction is markedly noisier — isolated-season accuracy ranged from 32.6% to 67.9% — due to small sample sizes (79–93 games per season) and structural shifts in postseason play (no back-to-backs, tighter rotations). Blending playoff games back into the combined dataset stabilizes accuracy into a consistent 60–66% band, and plusMinusPoints_roll10_diff remained the single strongest predictor across every model tested.</w:t>
+        <w:t xml:space="preserve">Taken together, all four model families converge to a similar ceiling of roughly 63–66% regular-season accuracy (ROC-AUC ≈ 0.65–0.71), pointing to an irreducible “any given night” noise floor in NBA outcomes rather than a modeling shortfall. </w:t>
       </w:r>
     </w:p>
     <w:p>
@@ -462,7 +512,7 @@
         <w:pStyle w:val="ListParagraph"/>
         <w:numPr>
           <w:ilvl w:val="0"/>
-          <w:numId w:val="1"/>
+          <w:numId w:val="2"/>
         </w:numPr>
         <w:spacing w:before="0" w:after="40"/>
         <w:rPr/>
@@ -480,7 +530,7 @@
         <w:pStyle w:val="ListParagraph"/>
         <w:numPr>
           <w:ilvl w:val="0"/>
-          <w:numId w:val="1"/>
+          <w:numId w:val="2"/>
         </w:numPr>
         <w:spacing w:before="0" w:after="40"/>
         <w:rPr/>
@@ -498,7 +548,7 @@
         <w:pStyle w:val="ListParagraph"/>
         <w:numPr>
           <w:ilvl w:val="0"/>
-          <w:numId w:val="1"/>
+          <w:numId w:val="2"/>
         </w:numPr>
         <w:spacing w:before="0" w:after="40"/>
         <w:rPr/>
@@ -516,7 +566,7 @@
         <w:pStyle w:val="ListParagraph"/>
         <w:numPr>
           <w:ilvl w:val="0"/>
-          <w:numId w:val="1"/>
+          <w:numId w:val="2"/>
         </w:numPr>
         <w:spacing w:before="0" w:after="40"/>
         <w:rPr/>
@@ -534,7 +584,7 @@
         <w:pStyle w:val="ListParagraph"/>
         <w:numPr>
           <w:ilvl w:val="0"/>
-          <w:numId w:val="1"/>
+          <w:numId w:val="2"/>
         </w:numPr>
         <w:spacing w:before="0" w:after="40"/>
         <w:rPr/>
@@ -702,6 +752,143 @@
   <w:abstractNum w:abstractNumId="2">
     <w:lvl w:ilvl="0">
       <w:start w:val="1"/>
+      <w:numFmt w:val="bullet"/>
+      <w:lvlText w:val=""/>
+      <w:lvlJc w:val="start"/>
+      <w:pPr>
+        <w:tabs>
+          <w:tab w:val="num" w:pos="0"/>
+        </w:tabs>
+        <w:ind w:start="720" w:hanging="360"/>
+      </w:pPr>
+      <w:rPr>
+        <w:rFonts w:ascii="Wingdings" w:hAnsi="Wingdings" w:cs="Wingdings" w:hint="default"/>
+      </w:rPr>
+    </w:lvl>
+    <w:lvl w:ilvl="1">
+      <w:start w:val="1"/>
+      <w:numFmt w:val="bullet"/>
+      <w:lvlText w:val=""/>
+      <w:lvlJc w:val="start"/>
+      <w:pPr>
+        <w:tabs>
+          <w:tab w:val="num" w:pos="0"/>
+        </w:tabs>
+        <w:ind w:start="1440" w:hanging="360"/>
+      </w:pPr>
+      <w:rPr>
+        <w:rFonts w:ascii="Wingdings 2" w:hAnsi="Wingdings 2" w:cs="Wingdings 2" w:hint="default"/>
+      </w:rPr>
+    </w:lvl>
+    <w:lvl w:ilvl="2">
+      <w:start w:val="1"/>
+      <w:numFmt w:val="bullet"/>
+      <w:lvlText w:val="■"/>
+      <w:lvlJc w:val="start"/>
+      <w:pPr>
+        <w:tabs>
+          <w:tab w:val="num" w:pos="0"/>
+        </w:tabs>
+        <w:ind w:start="2160" w:hanging="360"/>
+      </w:pPr>
+      <w:rPr>
+        <w:rFonts w:ascii="OpenSymbol" w:hAnsi="OpenSymbol" w:cs="OpenSymbol" w:hint="default"/>
+      </w:rPr>
+    </w:lvl>
+    <w:lvl w:ilvl="3">
+      <w:start w:val="1"/>
+      <w:numFmt w:val="bullet"/>
+      <w:lvlText w:val=""/>
+      <w:lvlJc w:val="start"/>
+      <w:pPr>
+        <w:tabs>
+          <w:tab w:val="num" w:pos="0"/>
+        </w:tabs>
+        <w:ind w:start="2880" w:hanging="360"/>
+      </w:pPr>
+      <w:rPr>
+        <w:rFonts w:ascii="Wingdings" w:hAnsi="Wingdings" w:cs="Wingdings" w:hint="default"/>
+      </w:rPr>
+    </w:lvl>
+    <w:lvl w:ilvl="4">
+      <w:start w:val="1"/>
+      <w:numFmt w:val="bullet"/>
+      <w:lvlText w:val=""/>
+      <w:lvlJc w:val="start"/>
+      <w:pPr>
+        <w:tabs>
+          <w:tab w:val="num" w:pos="0"/>
+        </w:tabs>
+        <w:ind w:start="3600" w:hanging="360"/>
+      </w:pPr>
+      <w:rPr>
+        <w:rFonts w:ascii="Wingdings 2" w:hAnsi="Wingdings 2" w:cs="Wingdings 2" w:hint="default"/>
+      </w:rPr>
+    </w:lvl>
+    <w:lvl w:ilvl="5">
+      <w:start w:val="1"/>
+      <w:numFmt w:val="bullet"/>
+      <w:lvlText w:val="■"/>
+      <w:lvlJc w:val="start"/>
+      <w:pPr>
+        <w:tabs>
+          <w:tab w:val="num" w:pos="0"/>
+        </w:tabs>
+        <w:ind w:start="4320" w:hanging="360"/>
+      </w:pPr>
+      <w:rPr>
+        <w:rFonts w:ascii="OpenSymbol" w:hAnsi="OpenSymbol" w:cs="OpenSymbol" w:hint="default"/>
+      </w:rPr>
+    </w:lvl>
+    <w:lvl w:ilvl="6">
+      <w:start w:val="1"/>
+      <w:numFmt w:val="bullet"/>
+      <w:lvlText w:val=""/>
+      <w:lvlJc w:val="start"/>
+      <w:pPr>
+        <w:tabs>
+          <w:tab w:val="num" w:pos="0"/>
+        </w:tabs>
+        <w:ind w:start="5040" w:hanging="360"/>
+      </w:pPr>
+      <w:rPr>
+        <w:rFonts w:ascii="Wingdings" w:hAnsi="Wingdings" w:cs="Wingdings" w:hint="default"/>
+      </w:rPr>
+    </w:lvl>
+    <w:lvl w:ilvl="7">
+      <w:start w:val="1"/>
+      <w:numFmt w:val="bullet"/>
+      <w:lvlText w:val=""/>
+      <w:lvlJc w:val="start"/>
+      <w:pPr>
+        <w:tabs>
+          <w:tab w:val="num" w:pos="0"/>
+        </w:tabs>
+        <w:ind w:start="5760" w:hanging="360"/>
+      </w:pPr>
+      <w:rPr>
+        <w:rFonts w:ascii="Wingdings" w:hAnsi="Wingdings" w:cs="Wingdings" w:hint="default"/>
+      </w:rPr>
+    </w:lvl>
+    <w:lvl w:ilvl="8">
+      <w:start w:val="1"/>
+      <w:numFmt w:val="bullet"/>
+      <w:lvlText w:val=""/>
+      <w:lvlJc w:val="start"/>
+      <w:pPr>
+        <w:tabs>
+          <w:tab w:val="num" w:pos="0"/>
+        </w:tabs>
+        <w:ind w:start="6480" w:hanging="360"/>
+      </w:pPr>
+      <w:rPr>
+        <w:rFonts w:ascii="Wingdings" w:hAnsi="Wingdings" w:cs="Wingdings" w:hint="default"/>
+      </w:rPr>
+    </w:lvl>
+  </w:abstractNum>
+  <w:abstractNum w:abstractNumId="3">
+    <w:lvl w:ilvl="0">
+      <w:start w:val="1"/>
       <w:numFmt w:val="none"/>
       <w:suff w:val="nothing"/>
       <w:lvlText w:val=""/>
@@ -825,7 +1012,10 @@
     <w:abstractNumId w:val="2"/>
   </w:num>
   <w:num w:numId="3">
-    <w:abstractNumId w:val="1"/>
+    <w:abstractNumId w:val="3"/>
+  </w:num>
+  <w:num w:numId="4">
+    <w:abstractNumId w:val="2"/>
     <w:lvlOverride w:ilvl="0">
       <w:startOverride w:val="1"/>
     </w:lvlOverride>
@@ -853,6 +1043,7 @@
     <w:qFormat/>
     <w:pPr>
       <w:widowControl/>
+      <w:suppressAutoHyphens w:val="true"/>
       <w:bidi w:val="0"/>
       <w:spacing w:before="0" w:after="0"/>
       <w:jc w:val="start"/>
@@ -937,11 +1128,18 @@
       <w:u w:val="single"/>
     </w:rPr>
   </w:style>
-  <w:style w:type="character" w:styleId="FootnoteCharacters">
-    <w:name w:val="Footnote Characters"/>
+  <w:style w:type="character" w:styleId="FootnoteCharactersuser">
+    <w:name w:val="Footnote Characters (user)"/>
     <w:uiPriority w:val="99"/>
     <w:semiHidden/>
     <w:unhideWhenUsed/>
+    <w:qFormat/>
+    <w:rPr>
+      <w:vertAlign w:val="superscript"/>
+    </w:rPr>
+  </w:style>
+  <w:style w:type="character" w:styleId="FootnoteCharacters">
+    <w:name w:val="Footnote Characters"/>
     <w:qFormat/>
     <w:rPr>
       <w:vertAlign w:val="superscript"/>
@@ -965,11 +1163,18 @@
       <w:szCs w:val="20"/>
     </w:rPr>
   </w:style>
-  <w:style w:type="character" w:styleId="EndnoteCharacters">
-    <w:name w:val="Endnote Characters"/>
+  <w:style w:type="character" w:styleId="EndnoteCharactersuser">
+    <w:name w:val="Endnote Characters (user)"/>
     <w:uiPriority w:val="99"/>
     <w:semiHidden/>
     <w:unhideWhenUsed/>
+    <w:qFormat/>
+    <w:rPr>
+      <w:vertAlign w:val="superscript"/>
+    </w:rPr>
+  </w:style>
+  <w:style w:type="character" w:styleId="EndnoteCharacters">
+    <w:name w:val="Endnote Characters"/>
     <w:qFormat/>
     <w:rPr>
       <w:vertAlign w:val="superscript"/>
@@ -1066,6 +1271,7 @@
     <w:qFormat/>
     <w:pPr>
       <w:widowControl/>
+      <w:suppressAutoHyphens w:val="true"/>
       <w:bidi w:val="0"/>
       <w:spacing w:before="0" w:after="0"/>
       <w:jc w:val="start"/>
@@ -1086,6 +1292,7 @@
     <w:qFormat/>
     <w:pPr>
       <w:widowControl/>
+      <w:suppressAutoHyphens w:val="true"/>
       <w:bidi w:val="0"/>
       <w:spacing w:before="0" w:after="0"/>
       <w:jc w:val="start"/>

</xml_diff>